<commit_message>
Youtube link uploaded in report
</commit_message>
<xml_diff>
--- a/submission_report.docx
+++ b/submission_report.docx
@@ -27,13 +27,14 @@
         <w:jc w:val="center"/>
         <w:rPr>
           <w:rFonts w:asciiTheme="minorHAnsi" w:hAnsiTheme="minorHAnsi" w:cstheme="minorHAnsi"/>
-          <w:sz w:val="22"/>
+          <w:sz w:val="18"/>
         </w:rPr>
       </w:pPr>
       <w:r>
         <w:rPr>
           <w:rFonts w:asciiTheme="minorHAnsi" w:hAnsiTheme="minorHAnsi" w:cstheme="minorHAnsi"/>
           <w:color w:val="444444"/>
+          <w:sz w:val="16"/>
           <w:szCs w:val="18"/>
         </w:rPr>
         <w:t xml:space="preserve">Team: </w:t>
@@ -44,6 +45,7 @@
         <w:rPr>
           <w:rFonts w:asciiTheme="minorHAnsi" w:hAnsiTheme="minorHAnsi" w:cstheme="minorHAnsi"/>
           <w:color w:val="444444"/>
+          <w:sz w:val="16"/>
           <w:szCs w:val="18"/>
         </w:rPr>
         <w:t>Timesware</w:t>
@@ -53,6 +55,7 @@
         <w:rPr>
           <w:rFonts w:asciiTheme="minorHAnsi" w:hAnsiTheme="minorHAnsi" w:cstheme="minorHAnsi"/>
           <w:color w:val="444444"/>
+          <w:sz w:val="16"/>
           <w:szCs w:val="18"/>
         </w:rPr>
         <w:t xml:space="preserve">  |</w:t>
@@ -62,9 +65,19 @@
         <w:rPr>
           <w:rFonts w:asciiTheme="minorHAnsi" w:hAnsiTheme="minorHAnsi" w:cstheme="minorHAnsi"/>
           <w:color w:val="444444"/>
+          <w:sz w:val="16"/>
           <w:szCs w:val="18"/>
         </w:rPr>
-        <w:t xml:space="preserve">  SLIIT Codefest 2026 AI Competition  |  YouTube demo link: [PASTE UNLISTED LINK HERE]</w:t>
+        <w:t xml:space="preserve">  SLIIT Codefest 2026 AI Competition  |  YouTube demo link: </w:t>
+      </w:r>
+      <w:r>
+        <w:rPr>
+          <w:rFonts w:asciiTheme="minorHAnsi" w:hAnsiTheme="minorHAnsi" w:cstheme="minorHAnsi"/>
+          <w:color w:val="444444"/>
+          <w:sz w:val="16"/>
+          <w:szCs w:val="18"/>
+        </w:rPr>
+        <w:t>https://youtu.be/zLsjWBAf8Sk?si=BTNLGSamJ8rM6B5o</w:t>
       </w:r>
     </w:p>
     <w:p>
@@ -101,7 +114,16 @@
           <w:rFonts w:asciiTheme="minorHAnsi" w:hAnsiTheme="minorHAnsi" w:cstheme="minorHAnsi"/>
           <w:sz w:val="22"/>
         </w:rPr>
-        <w:t xml:space="preserve">We chose Sub-track 1C: build an assistant that answers questions over the Ashen Era Archive by searching iteratively — deciding where to look, checking whether it has enough information, and refining its search when it </w:t>
+        <w:t>We chose Sub-track 1C: build an assistant that answers</w:t>
+      </w:r>
+      <w:bookmarkStart w:id="0" w:name="_GoBack"/>
+      <w:bookmarkEnd w:id="0"/>
+      <w:r>
+        <w:rPr>
+          <w:rFonts w:asciiTheme="minorHAnsi" w:hAnsiTheme="minorHAnsi" w:cstheme="minorHAnsi"/>
+          <w:sz w:val="22"/>
+        </w:rPr>
+        <w:t xml:space="preserve"> questions over the Ashen Era Archive by searching iteratively — deciding where to look, checking whether it has enough information, and refining its search when it </w:t>
       </w:r>
       <w:proofErr w:type="gramStart"/>
       <w:r>
@@ -117,14 +139,7 @@
           <w:rFonts w:asciiTheme="minorHAnsi" w:hAnsiTheme="minorHAnsi" w:cstheme="minorHAnsi"/>
           <w:sz w:val="22"/>
         </w:rPr>
-        <w:t>, rather than answering from a</w:t>
-      </w:r>
-      <w:r>
-        <w:rPr>
-          <w:rFonts w:asciiTheme="minorHAnsi" w:hAnsiTheme="minorHAnsi" w:cstheme="minorHAnsi"/>
-          <w:sz w:val="22"/>
-        </w:rPr>
-        <w:t xml:space="preserve"> single retrieval pass.</w:t>
+        <w:t>, rather than answering from a single retrieval pass.</w:t>
       </w:r>
     </w:p>
     <w:p>
@@ -157,14 +172,7 @@
           <w:rFonts w:asciiTheme="minorHAnsi" w:hAnsiTheme="minorHAnsi" w:cstheme="minorHAnsi"/>
           <w:sz w:val="22"/>
         </w:rPr>
-        <w:t>, and ephemera, but sources disagree (a tavern ballad vs. an official c</w:t>
-      </w:r>
-      <w:r>
-        <w:rPr>
-          <w:rFonts w:asciiTheme="minorHAnsi" w:hAnsiTheme="minorHAnsi" w:cstheme="minorHAnsi"/>
-          <w:sz w:val="22"/>
-        </w:rPr>
-        <w:t xml:space="preserve">odex entry), and no single document tells the whole story. A single-shot retrieval system cannot reliably surface conflicting sources or chase a multi-hop fact chain; ours </w:t>
+        <w:t xml:space="preserve">, and ephemera, but sources disagree (a tavern ballad vs. an official codex entry), and no single document tells the whole story. A single-shot retrieval system cannot reliably surface conflicting sources or chase a multi-hop fact chain; ours </w:t>
       </w:r>
       <w:proofErr w:type="gramStart"/>
       <w:r>
@@ -232,18 +240,7 @@
           <w:sz w:val="18"/>
           <w:szCs w:val="18"/>
         </w:rPr>
-        <w:t>/ → in</w:t>
-      </w:r>
-      <w:r>
-        <w:rPr>
-          <w:rFonts w:asciiTheme="minorHAnsi" w:hAnsiTheme="minorHAnsi" w:cstheme="minorHAnsi"/>
-          <w:i/>
-          <w:iCs/>
-          <w:color w:val="555555"/>
-          <w:sz w:val="18"/>
-          <w:szCs w:val="18"/>
-        </w:rPr>
-        <w:t>gest.py → data/</w:t>
+        <w:t>/ → ingest.py → data/</w:t>
       </w:r>
       <w:proofErr w:type="spellStart"/>
       <w:r>
@@ -342,14 +339,7 @@
           <w:rFonts w:asciiTheme="minorHAnsi" w:hAnsiTheme="minorHAnsi" w:cstheme="minorHAnsi"/>
           <w:sz w:val="22"/>
         </w:rPr>
-        <w:t>parses all 415 documents across five formats (PDF, DOCX, Markd</w:t>
-      </w:r>
-      <w:r>
-        <w:rPr>
-          <w:rFonts w:asciiTheme="minorHAnsi" w:hAnsiTheme="minorHAnsi" w:cstheme="minorHAnsi"/>
-          <w:sz w:val="22"/>
-        </w:rPr>
-        <w:t xml:space="preserve">own, plain text, </w:t>
+        <w:t xml:space="preserve">parses all 415 documents across five formats (PDF, DOCX, Markdown, </w:t>
       </w:r>
       <w:proofErr w:type="gramStart"/>
       <w:r>
@@ -357,7 +347,7 @@
           <w:rFonts w:asciiTheme="minorHAnsi" w:hAnsiTheme="minorHAnsi" w:cstheme="minorHAnsi"/>
           <w:sz w:val="22"/>
         </w:rPr>
-        <w:t>scanned</w:t>
+        <w:t>plain</w:t>
       </w:r>
       <w:proofErr w:type="gramEnd"/>
       <w:r>
@@ -365,7 +355,7 @@
           <w:rFonts w:asciiTheme="minorHAnsi" w:hAnsiTheme="minorHAnsi" w:cstheme="minorHAnsi"/>
           <w:sz w:val="22"/>
         </w:rPr>
-        <w:t xml:space="preserve"> images), with OCR for scanned content, format deduplication, and a fix for a </w:t>
+        <w:t xml:space="preserve"> text, scanned images), with OCR for scanned content, format deduplication, and a fix for a </w:t>
       </w:r>
       <w:proofErr w:type="spellStart"/>
       <w:r>
@@ -432,14 +422,7 @@
           <w:rFonts w:asciiTheme="minorHAnsi" w:hAnsiTheme="minorHAnsi" w:cstheme="minorHAnsi"/>
           <w:sz w:val="22"/>
         </w:rPr>
-        <w:t>embeds all chunks with a local sentence-transf</w:t>
-      </w:r>
-      <w:r>
-        <w:rPr>
-          <w:rFonts w:asciiTheme="minorHAnsi" w:hAnsiTheme="minorHAnsi" w:cstheme="minorHAnsi"/>
-          <w:sz w:val="22"/>
-        </w:rPr>
-        <w:t>ormers model (BAAI/bge-large-en-v1.5) into a local Chroma vector store.</w:t>
+        <w:t>embeds all chunks with a local sentence-transformers model (BAAI/bge-large-en-v1.5) into a local Chroma vector store.</w:t>
       </w:r>
     </w:p>
     <w:p>
@@ -506,14 +489,7 @@
           <w:rFonts w:asciiTheme="minorHAnsi" w:hAnsiTheme="minorHAnsi" w:cstheme="minorHAnsi"/>
           <w:sz w:val="22"/>
         </w:rPr>
-        <w:t xml:space="preserve"> </w:t>
-      </w:r>
-      <w:r>
-        <w:rPr>
-          <w:rFonts w:asciiTheme="minorHAnsi" w:hAnsiTheme="minorHAnsi" w:cstheme="minorHAnsi"/>
-          <w:sz w:val="22"/>
-        </w:rPr>
-        <w:t>iterations), then synthesize a final cited answer that explicitly flags source conflicts.</w:t>
+        <w:t xml:space="preserve"> iterations), then synthesize a final cited answer that explicitly flags source conflicts.</w:t>
       </w:r>
     </w:p>
     <w:p>
@@ -583,14 +559,7 @@
           <w:rFonts w:asciiTheme="minorHAnsi" w:hAnsiTheme="minorHAnsi" w:cstheme="minorHAnsi"/>
           <w:sz w:val="22"/>
         </w:rPr>
-        <w:t>Voyage's free tier requires a payment card for usable rate limits; we chose a local model to</w:t>
-      </w:r>
-      <w:r>
-        <w:rPr>
-          <w:rFonts w:asciiTheme="minorHAnsi" w:hAnsiTheme="minorHAnsi" w:cstheme="minorHAnsi"/>
-          <w:sz w:val="22"/>
-        </w:rPr>
-        <w:t xml:space="preserve"> avoid this entirely, at the cost of slower one-time embedding throughput.</w:t>
+        <w:t>Voyage's free tier requires a payment card for usable rate limits; we chose a local model to avoid this entirely, at the cost of slower one-time embedding throughput.</w:t>
       </w:r>
     </w:p>
     <w:p>
@@ -642,14 +611,7 @@
           <w:rFonts w:asciiTheme="minorHAnsi" w:hAnsiTheme="minorHAnsi" w:cstheme="minorHAnsi"/>
           <w:sz w:val="22"/>
         </w:rPr>
-        <w:t>specific free model IDs went stale (404) within the same day during development; the auto-router avoids hardcoding a slug that</w:t>
-      </w:r>
-      <w:r>
-        <w:rPr>
-          <w:rFonts w:asciiTheme="minorHAnsi" w:hAnsiTheme="minorHAnsi" w:cstheme="minorHAnsi"/>
-          <w:sz w:val="22"/>
-        </w:rPr>
-        <w:t xml:space="preserve"> expires.</w:t>
+        <w:t>specific free model IDs went stale (404) within the same day during development; the auto-router avoids hardcoding a slug that expires.</w:t>
       </w:r>
     </w:p>
     <w:p>
@@ -714,18 +676,7 @@
           <w:sz w:val="18"/>
           <w:szCs w:val="18"/>
         </w:rPr>
-        <w:t>Full reasoning and trade-offs</w:t>
-      </w:r>
-      <w:r>
-        <w:rPr>
-          <w:rFonts w:asciiTheme="minorHAnsi" w:hAnsiTheme="minorHAnsi" w:cstheme="minorHAnsi"/>
-          <w:i/>
-          <w:iCs/>
-          <w:color w:val="555555"/>
-          <w:sz w:val="18"/>
-          <w:szCs w:val="18"/>
-        </w:rPr>
-        <w:t xml:space="preserve"> in docs/decisions.md.</w:t>
+        <w:t>Full reasoning and trade-offs in docs/decisions.md.</w:t>
       </w:r>
     </w:p>
     <w:p>
@@ -817,14 +768,7 @@
           <w:rFonts w:asciiTheme="minorHAnsi" w:hAnsiTheme="minorHAnsi" w:cstheme="minorHAnsi"/>
           <w:sz w:val="22"/>
         </w:rPr>
-        <w:t xml:space="preserve"> founding year: codex says 246 </w:t>
-      </w:r>
-      <w:r>
-        <w:rPr>
-          <w:rFonts w:asciiTheme="minorHAnsi" w:hAnsiTheme="minorHAnsi" w:cstheme="minorHAnsi"/>
-          <w:sz w:val="22"/>
-        </w:rPr>
-        <w:t>AS, an ephemera contract says 286 AS, the wiki says the matter is unresolved — the system surfaced all three rather than picking one).</w:t>
+        <w:t xml:space="preserve"> founding year: codex says 246 AS, an ephemera contract says 286 AS, the wiki says the matter is unresolved — the system surfaced all three rather than picking one).</w:t>
       </w:r>
     </w:p>
     <w:p>
@@ -854,14 +798,7 @@
           <w:rFonts w:asciiTheme="minorHAnsi" w:hAnsiTheme="minorHAnsi" w:cstheme="minorHAnsi"/>
           <w:sz w:val="22"/>
         </w:rPr>
-        <w:t>when asked what happened to a named individual after a specific in-world event, and t</w:t>
-      </w:r>
-      <w:r>
-        <w:rPr>
-          <w:rFonts w:asciiTheme="minorHAnsi" w:hAnsiTheme="minorHAnsi" w:cstheme="minorHAnsi"/>
-          <w:sz w:val="22"/>
-        </w:rPr>
-        <w:t xml:space="preserve">he corpus genuinely doesn't say, the system iterated the full 5-search </w:t>
+        <w:t xml:space="preserve">when asked what happened to a named individual after a specific in-world event, and the corpus genuinely doesn't say, the system iterated the full 5-search </w:t>
       </w:r>
       <w:r>
         <w:rPr>
@@ -899,14 +836,7 @@
           <w:rFonts w:asciiTheme="minorHAnsi" w:hAnsiTheme="minorHAnsi" w:cstheme="minorHAnsi"/>
           <w:sz w:val="22"/>
         </w:rPr>
-        <w:t xml:space="preserve">when </w:t>
-      </w:r>
-      <w:r>
-        <w:rPr>
-          <w:rFonts w:asciiTheme="minorHAnsi" w:hAnsiTheme="minorHAnsi" w:cstheme="minorHAnsi"/>
-          <w:sz w:val="22"/>
-        </w:rPr>
-        <w:t xml:space="preserve">asked whether a historical event </w:t>
+        <w:t xml:space="preserve">when asked whether a historical event </w:t>
       </w:r>
       <w:proofErr w:type="gramStart"/>
       <w:r>
@@ -943,14 +873,7 @@
           <w:rFonts w:asciiTheme="minorHAnsi" w:hAnsiTheme="minorHAnsi" w:cstheme="minorHAnsi"/>
           <w:sz w:val="22"/>
         </w:rPr>
-        <w:t>Correctly caught a false premise in th</w:t>
-      </w:r>
-      <w:r>
-        <w:rPr>
-          <w:rFonts w:asciiTheme="minorHAnsi" w:hAnsiTheme="minorHAnsi" w:cstheme="minorHAnsi"/>
-          <w:sz w:val="22"/>
-        </w:rPr>
-        <w:t>e framing of one test question, refusing to accept the question's built-in assumption once evidence contradicted it.</w:t>
+        <w:t>Correctly caught a false premise in the framing of one test question, refusing to accept the question's built-in assumption once evidence contradicted it.</w:t>
       </w:r>
     </w:p>
     <w:p>
@@ -1012,14 +935,7 @@
           <w:rFonts w:asciiTheme="minorHAnsi" w:hAnsiTheme="minorHAnsi" w:cstheme="minorHAnsi"/>
           <w:sz w:val="22"/>
         </w:rPr>
-        <w:t>The free LLM router occasionally returns a non-JSON response (o</w:t>
-      </w:r>
-      <w:r>
-        <w:rPr>
-          <w:rFonts w:asciiTheme="minorHAnsi" w:hAnsiTheme="minorHAnsi" w:cstheme="minorHAnsi"/>
-          <w:sz w:val="22"/>
-        </w:rPr>
-        <w:t>bserved: a stray safety-classifier-style string) — mitigated with automatic retry, which succeeded in every observed case, but the underlying inconsistency is a property of the free-tier model pool.</w:t>
+        <w:t>The free LLM router occasionally returns a non-JSON response (observed: a stray safety-classifier-style string) — mitigated with automatic retry, which succeeded in every observed case, but the underlying inconsistency is a property of the free-tier model pool.</w:t>
       </w:r>
     </w:p>
     <w:p>
@@ -1040,14 +956,7 @@
           <w:rFonts w:asciiTheme="minorHAnsi" w:hAnsiTheme="minorHAnsi" w:cstheme="minorHAnsi"/>
           <w:sz w:val="22"/>
         </w:rPr>
-        <w:t xml:space="preserve">Some questions resolve in a single search iteration when </w:t>
-      </w:r>
-      <w:r>
-        <w:rPr>
-          <w:rFonts w:asciiTheme="minorHAnsi" w:hAnsiTheme="minorHAnsi" w:cstheme="minorHAnsi"/>
-          <w:sz w:val="22"/>
-        </w:rPr>
-        <w:t>the first retrieval happens to surface everything needed; the system has no mechanism to force a second cross-verifying search.</w:t>
+        <w:t>Some questions resolve in a single search iteration when the first retrieval happens to surface everything needed; the system has no mechanism to force a second cross-verifying search.</w:t>
       </w:r>
     </w:p>
     <w:p>
@@ -1145,14 +1054,7 @@
           <w:rFonts w:asciiTheme="minorHAnsi" w:hAnsiTheme="minorHAnsi" w:cstheme="minorHAnsi"/>
           <w:sz w:val="22"/>
         </w:rPr>
-        <w:t xml:space="preserve"> per the challenge document's appendix; sw</w:t>
-      </w:r>
-      <w:r>
-        <w:rPr>
-          <w:rFonts w:asciiTheme="minorHAnsi" w:hAnsiTheme="minorHAnsi" w:cstheme="minorHAnsi"/>
-          <w:sz w:val="22"/>
-        </w:rPr>
-        <w:t>itched to a local model after hitting the payment-card requirement.</w:t>
+        <w:t xml:space="preserve"> per the challenge document's appendix; switched to a local model after hitting the payment-card requirement.</w:t>
       </w:r>
     </w:p>
     <w:p>
@@ -1249,14 +1151,7 @@
           <w:rFonts w:asciiTheme="minorHAnsi" w:hAnsiTheme="minorHAnsi" w:cstheme="minorHAnsi"/>
           <w:sz w:val="22"/>
         </w:rPr>
-        <w:t>See ai_usage/ai-u</w:t>
-      </w:r>
-      <w:r>
-        <w:rPr>
-          <w:rFonts w:asciiTheme="minorHAnsi" w:hAnsiTheme="minorHAnsi" w:cstheme="minorHAnsi"/>
-          <w:sz w:val="22"/>
-        </w:rPr>
-        <w:t xml:space="preserve">sage-disclosure.md for full detail. Summary: Claude </w:t>
+        <w:t xml:space="preserve">See ai_usage/ai-usage-disclosure.md for full detail. Summary: Claude </w:t>
       </w:r>
       <w:proofErr w:type="gramStart"/>
       <w:r>
@@ -1288,14 +1183,7 @@
           <w:rFonts w:asciiTheme="minorHAnsi" w:hAnsiTheme="minorHAnsi" w:cstheme="minorHAnsi"/>
           <w:sz w:val="22"/>
         </w:rPr>
-        <w:t xml:space="preserve"> and a local embedding model are runtime components of the submitted system itself, not development tools</w:t>
-      </w:r>
-      <w:r>
-        <w:rPr>
-          <w:rFonts w:asciiTheme="minorHAnsi" w:hAnsiTheme="minorHAnsi" w:cstheme="minorHAnsi"/>
-          <w:sz w:val="22"/>
-        </w:rPr>
-        <w:t xml:space="preserve">. </w:t>
+        <w:t xml:space="preserve"> and a local embedding model are runtime components of the submitted system itself, not development tools. </w:t>
       </w:r>
       <w:proofErr w:type="gramStart"/>
       <w:r>
@@ -1486,12 +1374,6 @@
         <w:gridCol w:w="3117"/>
       </w:tblGrid>
       <w:tr>
-        <w:tblPrEx>
-          <w:tblCellMar>
-            <w:top w:w="0" w:type="dxa"/>
-            <w:bottom w:w="0" w:type="dxa"/>
-          </w:tblCellMar>
-        </w:tblPrEx>
         <w:trPr>
           <w:cantSplit/>
         </w:trPr>
@@ -1593,12 +1475,6 @@
         </w:tc>
       </w:tr>
       <w:tr>
-        <w:tblPrEx>
-          <w:tblCellMar>
-            <w:top w:w="0" w:type="dxa"/>
-            <w:bottom w:w="0" w:type="dxa"/>
-          </w:tblCellMar>
-        </w:tblPrEx>
         <w:trPr>
           <w:cantSplit/>
         </w:trPr>
@@ -1684,26 +1560,12 @@
                 <w:sz w:val="22"/>
                 <w:szCs w:val="18"/>
               </w:rPr>
-              <w:t>Led technical architecture and implementation: built the ingestion pipeline (multi-format parsing, OCR, deduplication, encoding fixes), the embedding pipeline, and the core orchestrator loop. Ran all testing and manually verified results against source doc</w:t>
-            </w:r>
-            <w:r>
-              <w:rPr>
-                <w:rFonts w:asciiTheme="minorHAnsi" w:hAnsiTheme="minorHAnsi" w:cstheme="minorHAnsi"/>
-                <w:sz w:val="22"/>
-                <w:szCs w:val="18"/>
-              </w:rPr>
-              <w:t>uments. Coordinated repo structure, documentation, and submission packaging.</w:t>
+              <w:t>Led technical architecture and implementation: built the ingestion pipeline (multi-format parsing, OCR, deduplication, encoding fixes), the embedding pipeline, and the core orchestrator loop. Ran all testing and manually verified results against source documents. Coordinated repo structure, documentation, and submission packaging.</w:t>
             </w:r>
           </w:p>
         </w:tc>
       </w:tr>
       <w:tr>
-        <w:tblPrEx>
-          <w:tblCellMar>
-            <w:top w:w="0" w:type="dxa"/>
-            <w:bottom w:w="0" w:type="dxa"/>
-          </w:tblCellMar>
-        </w:tblPrEx>
         <w:trPr>
           <w:cantSplit/>
         </w:trPr>
@@ -1821,12 +1683,6 @@
         </w:tc>
       </w:tr>
       <w:tr>
-        <w:tblPrEx>
-          <w:tblCellMar>
-            <w:top w:w="0" w:type="dxa"/>
-            <w:bottom w:w="0" w:type="dxa"/>
-          </w:tblCellMar>
-        </w:tblPrEx>
         <w:trPr>
           <w:cantSplit/>
         </w:trPr>
@@ -1863,15 +1719,7 @@
                 <w:sz w:val="22"/>
                 <w:szCs w:val="18"/>
               </w:rPr>
-              <w:t>A</w:t>
-            </w:r>
-            <w:r>
-              <w:rPr>
-                <w:rFonts w:asciiTheme="minorHAnsi" w:hAnsiTheme="minorHAnsi" w:cstheme="minorHAnsi"/>
-                <w:sz w:val="22"/>
-                <w:szCs w:val="18"/>
-              </w:rPr>
-              <w:t>ssadh</w:t>
+              <w:t>Assadh</w:t>
             </w:r>
             <w:proofErr w:type="spellEnd"/>
           </w:p>
@@ -1952,12 +1800,6 @@
         </w:tc>
       </w:tr>
       <w:tr>
-        <w:tblPrEx>
-          <w:tblCellMar>
-            <w:top w:w="0" w:type="dxa"/>
-            <w:bottom w:w="0" w:type="dxa"/>
-          </w:tblCellMar>
-        </w:tblPrEx>
         <w:trPr>
           <w:cantSplit/>
         </w:trPr>
@@ -2051,15 +1893,7 @@
                 <w:sz w:val="22"/>
                 <w:szCs w:val="18"/>
               </w:rPr>
-              <w:t>Deliverable</w:t>
-            </w:r>
-            <w:r>
-              <w:rPr>
-                <w:rFonts w:asciiTheme="minorHAnsi" w:hAnsiTheme="minorHAnsi" w:cstheme="minorHAnsi"/>
-                <w:sz w:val="22"/>
-                <w:szCs w:val="18"/>
-              </w:rPr>
-              <w:t xml:space="preserve">s and presentation: prepared the demo video plan and live-demo script, assembled the submission report content, and helped organize the </w:t>
+              <w:t xml:space="preserve">Deliverables and presentation: prepared the demo video plan and live-demo script, assembled the submission report content, and helped organize the </w:t>
             </w:r>
             <w:proofErr w:type="spellStart"/>
             <w:r>
@@ -2090,8 +1924,6 @@
           <w:rFonts w:asciiTheme="minorHAnsi" w:hAnsiTheme="minorHAnsi" w:cstheme="minorHAnsi"/>
         </w:rPr>
       </w:pPr>
-      <w:bookmarkStart w:id="0" w:name="_GoBack"/>
-      <w:bookmarkEnd w:id="0"/>
     </w:p>
     <w:sectPr>
       <w:pgSz w:w="12240" w:h="15840"/>

</xml_diff>